<commit_message>
thêm tên người liên hệ, số di động của khách hàng, email của khách hàng vào template
</commit_message>
<xml_diff>
--- a/contract/template/Apricot_YEP_package1_dinner.docx
+++ b/contract/template/Apricot_YEP_package1_dinner.docx
@@ -4455,6 +4455,17 @@
                 <w:szCs w:val="23"/>
               </w:rPr>
             </w:pPr>
+            <w:r>
+              <w:rPr>
+                <w:rFonts w:asciiTheme="minorHAnsi" w:eastAsia="PMingLiU" w:hAnsiTheme="minorHAnsi" w:cstheme="minorHAnsi"/>
+                <w:b/>
+                <w:noProof/>
+                <w:color w:val="FFFFFF" w:themeColor="background1"/>
+                <w:sz w:val="23"/>
+                <w:szCs w:val="23"/>
+              </w:rPr>
+              <w:t>{{name_for_attention_of}}</w:t>
+            </w:r>
           </w:p>
         </w:tc>
       </w:tr>
@@ -4789,6 +4800,18 @@
                 <w:lang w:val="en-US"/>
               </w:rPr>
             </w:pPr>
+            <w:r>
+              <w:rPr>
+                <w:rFonts w:asciiTheme="minorHAnsi" w:hAnsiTheme="minorHAnsi" w:cstheme="minorHAnsi"/>
+                <w:i/>
+                <w:iCs/>
+                <w:color w:val="000000"/>
+                <w:sz w:val="23"/>
+                <w:szCs w:val="23"/>
+                <w:lang w:val="en-US"/>
+              </w:rPr>
+              <w:t>{{client_mobile_phone}}</w:t>
+            </w:r>
           </w:p>
         </w:tc>
       </w:tr>
@@ -4839,6 +4862,17 @@
                 <w:lang w:val="en-US"/>
               </w:rPr>
             </w:pPr>
+            <w:r>
+              <w:rPr>
+                <w:rFonts w:asciiTheme="minorHAnsi" w:hAnsiTheme="minorHAnsi" w:cstheme="minorHAnsi"/>
+                <w:i/>
+                <w:iCs/>
+                <w:sz w:val="23"/>
+                <w:szCs w:val="23"/>
+                <w:lang w:val="en-US"/>
+              </w:rPr>
+              <w:t>{{client_email}}</w:t>
+            </w:r>
           </w:p>
         </w:tc>
       </w:tr>

</xml_diff>

<commit_message>
in đậm tên công ty tiếng anh và tiếng việt
</commit_message>
<xml_diff>
--- a/contract/template/Apricot_YEP_package1_dinner.docx
+++ b/contract/template/Apricot_YEP_package1_dinner.docx
@@ -274,6 +274,8 @@
             <w:r>
               <w:rPr>
                 <w:rFonts w:asciiTheme="minorHAnsi" w:hAnsiTheme="minorHAnsi" w:cstheme="minorHAnsi"/>
+                <w:b/>
+                <w:bCs/>
                 <w:sz w:val="23"/>
                 <w:szCs w:val="23"/>
               </w:rPr>
@@ -2222,6 +2224,8 @@
       <w:r>
         <w:rPr>
           <w:rFonts w:asciiTheme="minorHAnsi" w:hAnsiTheme="minorHAnsi" w:cstheme="minorHAnsi"/>
+          <w:b/>
+          <w:bCs/>
           <w:i/>
           <w:iCs/>
           <w:sz w:val="23"/>

</xml_diff>